<commit_message>
Add problem audit (2.1), depth-interview rationale (4.1), 9-survey-methods framing (5.1) to report; add 4 presenter Q&A cards
</commit_message>
<xml_diff>
--- a/files/Danone_Report_v4_final.docx
+++ b/files/Danone_Report_v4_final.docx
@@ -658,7 +658,7 @@
         <w:pStyle w:val="Heading2"/>
       </w:pPr>
       <w:r>
-        <w:t xml:space="preserve">2.1 Management Decision Problem</w:t>
+        <w:t xml:space="preserve">2.1 Problem Identification and the Problem Audit</w:t>
       </w:r>
     </w:p>
     <w:p>
@@ -667,15 +667,7 @@
         <w:jc w:val="both"/>
       </w:pPr>
       <w:r>
-        <w:t xml:space="preserve">The management decision problem asks what the decision maker needs to do. It is action oriented. For Danone Egypt it is stated as: Should Danone Egypt expand its distribution reach to compete with Juhayna's coverage in the Egyptian dairy market?</w:t>
-      </w:r>
-    </w:p>
-    <w:p>
-      <w:pPr>
-        <w:pStyle w:val="Heading2"/>
-      </w:pPr>
-      <w:r>
-        <w:t xml:space="preserve">2.2 Marketing Research Problem</w:t>
+        <w:t xml:space="preserve">Before the problem can be defined it must first be identified and understood. Following Malhotra, problem identification draws on four tasks: discussions with the decision makers, interviews with industry experts, analysis of secondary data, and qualitative research. The structured discussion with the decision maker is known as the problem audit, a thorough review of the history of the problem, the alternative courses of action available, the criteria by which those actions will be judged, and the way the eventual answer will be used.</w:t>
       </w:r>
     </w:p>
     <w:p>
@@ -684,15 +676,7 @@
         <w:jc w:val="both"/>
       </w:pPr>
       <w:r>
-        <w:t xml:space="preserve">The marketing research problem asks what information is needed and how it can best be obtained. It is information oriented. Following Malhotra, it is expressed first as a broad statement and then broken into specific components that guide the rest of the study.</w:t>
-      </w:r>
-    </w:p>
-    <w:p>
-      <w:pPr>
-        <w:pStyle w:val="Heading3"/>
-      </w:pPr>
-      <w:r>
-        <w:t xml:space="preserve">Broad Statement</w:t>
+        <w:t xml:space="preserve">For this project the problem audit was carried out mainly through an internal source. One of our team members, Tariq, worked at Danone Egypt and provided first-hand knowledge of the distribution and availability issue: how it arose, the options the company weighs to address it, and the objectives management applies when judging those options. This internal input played the role of the decision-maker discussion that a problem audit requires, and it was complemented by the analysis of secondary data from company and market sources and by qualitative depth interviews with small-shop owners. Together these tasks moved the study from a broad symptom, weaker shelf presence than Juhayna, to a clearly defined problem.</w:t>
       </w:r>
     </w:p>
     <w:p>
@@ -701,15 +685,7 @@
         <w:jc w:val="both"/>
       </w:pPr>
       <w:r>
-        <w:t xml:space="preserve">To determine the extent to which limited product availability affects Egyptian consumers' yogurt purchase decisions and Danone's brand switching and lost sales, and to identify the distribution barriers from the retailer's perspective.</w:t>
-      </w:r>
-    </w:p>
-    <w:p>
-      <w:pPr>
-        <w:pStyle w:val="Heading3"/>
-      </w:pPr>
-      <w:r>
-        <w:t xml:space="preserve">Specific Components</w:t>
+        <w:t xml:space="preserve">The problem audit covered the following points:</w:t>
       </w:r>
     </w:p>
     <w:p>
@@ -722,7 +698,7 @@
         <w:spacing w:after="60"/>
       </w:pPr>
       <w:r>
-        <w:t xml:space="preserve">Purchase behaviour and channel: where consumers buy yogurt and how important availability is in their brand choice.</w:t>
+        <w:t xml:space="preserve">History of the problem: Danone reaches about 100,000 outlets against Juhayna's coverage of roughly 136,000 outlets and 38 distribution centres, a gap of about 26 percent that is widest in traditional grocery and rural trade.</w:t>
       </w:r>
     </w:p>
     <w:p>
@@ -735,7 +711,7 @@
         <w:spacing w:after="60"/>
       </w:pPr>
       <w:r>
-        <w:t xml:space="preserve">Comparative availability: how the perceived availability of Danone compares with Juhayna and other competitors.</w:t>
+        <w:t xml:space="preserve">Alternative courses of action: whether Danone should expand its distribution reach, for example by extending its rural micro-distributor (OMDA) model and field coverage, or maintain its current footprint.</w:t>
       </w:r>
     </w:p>
     <w:p>
@@ -748,7 +724,7 @@
         <w:spacing w:after="60"/>
       </w:pPr>
       <w:r>
-        <w:t xml:space="preserve">Lost sales and switching: how often consumers switch away from Danone specifically because it is unavailable, and the resulting lost sales.</w:t>
+        <w:t xml:space="preserve">Criteria for judging the alternatives: the ability to match Juhayna's availability, to recover sales lost to unavailability and brand switching, and to reach the underserved traditional and rural segments.</w:t>
       </w:r>
     </w:p>
     <w:p>
@@ -761,36 +737,7 @@
         <w:spacing w:after="60"/>
       </w:pPr>
       <w:r>
-        <w:t xml:space="preserve">Segmentation of the gap: whether the availability gap differs by area type (urban versus rural) and store type.</w:t>
-      </w:r>
-    </w:p>
-    <w:p>
-      <w:pPr>
-        <w:pStyle w:val="ListParagraph"/>
-        <w:numPr>
-          <w:ilvl w:val="0"/>
-          <w:numId w:val="3"/>
-        </w:numPr>
-        <w:spacing w:after="120"/>
-      </w:pPr>
-      <w:r>
-        <w:t xml:space="preserve">Retailer-side barriers: from the grocer's perspective, what prevents stocking Danone compared with Juhayna (margins, representative visits, delivery and credit terms, refrigeration).</w:t>
-      </w:r>
-    </w:p>
-    <w:p>
-      <w:pPr>
-        <w:pStyle w:val="Heading2"/>
-      </w:pPr>
-      <w:r>
-        <w:t xml:space="preserve">2.3 Components of the Approach</w:t>
-      </w:r>
-    </w:p>
-    <w:p>
-      <w:pPr>
-        <w:pStyle w:val="Heading3"/>
-      </w:pPr>
-      <w:r>
-        <w:t xml:space="preserve">Objective and Theoretical Framework</w:t>
+        <w:t xml:space="preserve">Use of the findings: to decide whether investment in route-to-market and distribution is justified, which is the management decision problem stated below.</w:t>
       </w:r>
     </w:p>
     <w:p>
@@ -799,15 +746,15 @@
         <w:jc w:val="both"/>
       </w:pPr>
       <w:r>
-        <w:t xml:space="preserve">The study draws on the marketing principle that distribution, the place element of the marketing mix, converts brand preference into actual purchase only when the product is physically available at the point and moment of decision. When a preferred brand is absent from the shelf, consumers frequently substitute an available competitor, generating lost sales for the absent brand. This framework links three constructs: physical availability, consumer purchase behaviour, and brand switching.</w:t>
-      </w:r>
-    </w:p>
-    <w:p>
-      <w:pPr>
-        <w:pStyle w:val="Heading3"/>
-      </w:pPr>
-      <w:r>
-        <w:t xml:space="preserve">Analytical Model</w:t>
+        <w:t xml:space="preserve">Because the project was carried out by an external student team rather than by Danone's own management, a full formal problem audit with the company's distribution decision maker was not possible. The internal-source input above is used as a close and credible substitute, in keeping with the transparent, learning-oriented scope of this study.</w:t>
+      </w:r>
+    </w:p>
+    <w:p>
+      <w:pPr>
+        <w:pStyle w:val="Heading2"/>
+      </w:pPr>
+      <w:r>
+        <w:t xml:space="preserve">2.2 Management Decision Problem</w:t>
       </w:r>
     </w:p>
     <w:p>
@@ -816,7 +763,24 @@
         <w:jc w:val="both"/>
       </w:pPr>
       <w:r>
-        <w:t xml:space="preserve">The conceptual model proposes that the perceived availability of a brand influences purchase of that brand, both directly and through its effect on the consumer's likelihood of substituting a competing brand when the preferred brand is not found. Availability is expected to interact with area type, with the gap between Danone and Juhayna being wider outside the major cities.</w:t>
+        <w:t xml:space="preserve">The management decision problem asks what the decision maker needs to do. It is action oriented. For Danone Egypt it is stated as: Should Danone Egypt expand its distribution reach to compete with Juhayna's coverage in the Egyptian dairy market?</w:t>
+      </w:r>
+    </w:p>
+    <w:p>
+      <w:pPr>
+        <w:pStyle w:val="Heading2"/>
+      </w:pPr>
+      <w:r>
+        <w:t xml:space="preserve">2.3 Marketing Research Problem</w:t>
+      </w:r>
+    </w:p>
+    <w:p>
+      <w:pPr>
+        <w:spacing w:after="140"/>
+        <w:jc w:val="both"/>
+      </w:pPr>
+      <w:r>
+        <w:t xml:space="preserve">The marketing research problem asks what information is needed and how it can best be obtained. It is information oriented. Following Malhotra, it is expressed first as a broad statement and then broken into specific components that guide the rest of the study.</w:t>
       </w:r>
     </w:p>
     <w:p>
@@ -824,7 +788,24 @@
         <w:pStyle w:val="Heading3"/>
       </w:pPr>
       <w:r>
-        <w:t xml:space="preserve">Research Questions</w:t>
+        <w:t xml:space="preserve">Broad Statement</w:t>
+      </w:r>
+    </w:p>
+    <w:p>
+      <w:pPr>
+        <w:spacing w:after="140"/>
+        <w:jc w:val="both"/>
+      </w:pPr>
+      <w:r>
+        <w:t xml:space="preserve">To determine the extent to which limited product availability affects Egyptian consumers' yogurt purchase decisions and Danone's brand switching and lost sales, and to identify the distribution barriers from the retailer's perspective.</w:t>
+      </w:r>
+    </w:p>
+    <w:p>
+      <w:pPr>
+        <w:pStyle w:val="Heading3"/>
+      </w:pPr>
+      <w:r>
+        <w:t xml:space="preserve">Specific Components</w:t>
       </w:r>
     </w:p>
     <w:p>
@@ -837,7 +818,7 @@
         <w:spacing w:after="60"/>
       </w:pPr>
       <w:r>
-        <w:t xml:space="preserve">Where do Egyptian consumers buy yogurt, and how important is availability in their brand choice?</w:t>
+        <w:t xml:space="preserve">Purchase behaviour and channel: where consumers buy yogurt and how important availability is in their brand choice.</w:t>
       </w:r>
     </w:p>
     <w:p>
@@ -850,7 +831,7 @@
         <w:spacing w:after="60"/>
       </w:pPr>
       <w:r>
-        <w:t xml:space="preserve">How does the perceived availability of Danone compare with Juhayna and other competitors?</w:t>
+        <w:t xml:space="preserve">Comparative availability: how the perceived availability of Danone compares with Juhayna and other competitors.</w:t>
       </w:r>
     </w:p>
     <w:p>
@@ -863,7 +844,7 @@
         <w:spacing w:after="60"/>
       </w:pPr>
       <w:r>
-        <w:t xml:space="preserve">How often do consumers switch away from Danone because it is unavailable?</w:t>
+        <w:t xml:space="preserve">Lost sales and switching: how often consumers switch away from Danone specifically because it is unavailable, and the resulting lost sales.</w:t>
       </w:r>
     </w:p>
     <w:p>
@@ -876,7 +857,7 @@
         <w:spacing w:after="60"/>
       </w:pPr>
       <w:r>
-        <w:t xml:space="preserve">Does the perceived availability gap differ by area type and store type?</w:t>
+        <w:t xml:space="preserve">Segmentation of the gap: whether the availability gap differs by area type (urban versus rural) and store type.</w:t>
       </w:r>
     </w:p>
     <w:p>
@@ -889,7 +870,15 @@
         <w:spacing w:after="120"/>
       </w:pPr>
       <w:r>
-        <w:t xml:space="preserve">From the retailer's side, what are the barriers to stocking Danone compared with Juhayna?</w:t>
+        <w:t xml:space="preserve">Retailer-side barriers: from the grocer's perspective, what prevents stocking Danone compared with Juhayna (margins, representative visits, delivery and credit terms, refrigeration).</w:t>
+      </w:r>
+    </w:p>
+    <w:p>
+      <w:pPr>
+        <w:pStyle w:val="Heading2"/>
+      </w:pPr>
+      <w:r>
+        <w:t xml:space="preserve">2.4 Components of the Approach</w:t>
       </w:r>
     </w:p>
     <w:p>
@@ -897,7 +886,41 @@
         <w:pStyle w:val="Heading3"/>
       </w:pPr>
       <w:r>
-        <w:t xml:space="preserve">Hypotheses</w:t>
+        <w:t xml:space="preserve">Objective and Theoretical Framework</w:t>
+      </w:r>
+    </w:p>
+    <w:p>
+      <w:pPr>
+        <w:spacing w:after="140"/>
+        <w:jc w:val="both"/>
+      </w:pPr>
+      <w:r>
+        <w:t xml:space="preserve">The study draws on the marketing principle that distribution, the place element of the marketing mix, converts brand preference into actual purchase only when the product is physically available at the point and moment of decision. When a preferred brand is absent from the shelf, consumers frequently substitute an available competitor, generating lost sales for the absent brand. This framework links three constructs: physical availability, consumer purchase behaviour, and brand switching.</w:t>
+      </w:r>
+    </w:p>
+    <w:p>
+      <w:pPr>
+        <w:pStyle w:val="Heading3"/>
+      </w:pPr>
+      <w:r>
+        <w:t xml:space="preserve">Analytical Model</w:t>
+      </w:r>
+    </w:p>
+    <w:p>
+      <w:pPr>
+        <w:spacing w:after="140"/>
+        <w:jc w:val="both"/>
+      </w:pPr>
+      <w:r>
+        <w:t xml:space="preserve">The conceptual model proposes that the perceived availability of a brand influences purchase of that brand, both directly and through its effect on the consumer's likelihood of substituting a competing brand when the preferred brand is not found. Availability is expected to interact with area type, with the gap between Danone and Juhayna being wider outside the major cities.</w:t>
+      </w:r>
+    </w:p>
+    <w:p>
+      <w:pPr>
+        <w:pStyle w:val="Heading3"/>
+      </w:pPr>
+      <w:r>
+        <w:t xml:space="preserve">Research Questions</w:t>
       </w:r>
     </w:p>
     <w:p>
@@ -910,7 +933,7 @@
         <w:spacing w:after="60"/>
       </w:pPr>
       <w:r>
-        <w:t xml:space="preserve">Product availability significantly influences yogurt brand choice.</w:t>
+        <w:t xml:space="preserve">Where do Egyptian consumers buy yogurt, and how important is availability in their brand choice?</w:t>
       </w:r>
     </w:p>
     <w:p>
@@ -923,7 +946,7 @@
         <w:spacing w:after="60"/>
       </w:pPr>
       <w:r>
-        <w:t xml:space="preserve">Danone's perceived availability is significantly lower than Juhayna's.</w:t>
+        <w:t xml:space="preserve">How does the perceived availability of Danone compare with Juhayna and other competitors?</w:t>
       </w:r>
     </w:p>
     <w:p>
@@ -936,7 +959,7 @@
         <w:spacing w:after="60"/>
       </w:pPr>
       <w:r>
-        <w:t xml:space="preserve">A significant share of consumers have switched from Danone to a competitor because Danone was unavailable.</w:t>
+        <w:t xml:space="preserve">How often do consumers switch away from Danone because it is unavailable?</w:t>
       </w:r>
     </w:p>
     <w:p>
@@ -945,6 +968,79 @@
         <w:numPr>
           <w:ilvl w:val="0"/>
           <w:numId w:val="5"/>
+        </w:numPr>
+        <w:spacing w:after="60"/>
+      </w:pPr>
+      <w:r>
+        <w:t xml:space="preserve">Does the perceived availability gap differ by area type and store type?</w:t>
+      </w:r>
+    </w:p>
+    <w:p>
+      <w:pPr>
+        <w:pStyle w:val="ListParagraph"/>
+        <w:numPr>
+          <w:ilvl w:val="0"/>
+          <w:numId w:val="5"/>
+        </w:numPr>
+        <w:spacing w:after="120"/>
+      </w:pPr>
+      <w:r>
+        <w:t xml:space="preserve">From the retailer's side, what are the barriers to stocking Danone compared with Juhayna?</w:t>
+      </w:r>
+    </w:p>
+    <w:p>
+      <w:pPr>
+        <w:pStyle w:val="Heading3"/>
+      </w:pPr>
+      <w:r>
+        <w:t xml:space="preserve">Hypotheses</w:t>
+      </w:r>
+    </w:p>
+    <w:p>
+      <w:pPr>
+        <w:pStyle w:val="ListParagraph"/>
+        <w:numPr>
+          <w:ilvl w:val="0"/>
+          <w:numId w:val="6"/>
+        </w:numPr>
+        <w:spacing w:after="60"/>
+      </w:pPr>
+      <w:r>
+        <w:t xml:space="preserve">Product availability significantly influences yogurt brand choice.</w:t>
+      </w:r>
+    </w:p>
+    <w:p>
+      <w:pPr>
+        <w:pStyle w:val="ListParagraph"/>
+        <w:numPr>
+          <w:ilvl w:val="0"/>
+          <w:numId w:val="6"/>
+        </w:numPr>
+        <w:spacing w:after="60"/>
+      </w:pPr>
+      <w:r>
+        <w:t xml:space="preserve">Danone's perceived availability is significantly lower than Juhayna's.</w:t>
+      </w:r>
+    </w:p>
+    <w:p>
+      <w:pPr>
+        <w:pStyle w:val="ListParagraph"/>
+        <w:numPr>
+          <w:ilvl w:val="0"/>
+          <w:numId w:val="6"/>
+        </w:numPr>
+        <w:spacing w:after="60"/>
+      </w:pPr>
+      <w:r>
+        <w:t xml:space="preserve">A significant share of consumers have switched from Danone to a competitor because Danone was unavailable.</w:t>
+      </w:r>
+    </w:p>
+    <w:p>
+      <w:pPr>
+        <w:pStyle w:val="ListParagraph"/>
+        <w:numPr>
+          <w:ilvl w:val="0"/>
+          <w:numId w:val="6"/>
         </w:numPr>
         <w:spacing w:after="120"/>
       </w:pPr>
@@ -1547,7 +1643,7 @@
         <w:pStyle w:val="ListParagraph"/>
         <w:numPr>
           <w:ilvl w:val="0"/>
-          <w:numId w:val="6"/>
+          <w:numId w:val="3"/>
         </w:numPr>
         <w:spacing w:after="60"/>
       </w:pPr>
@@ -1572,7 +1668,7 @@
         <w:pStyle w:val="ListParagraph"/>
         <w:numPr>
           <w:ilvl w:val="0"/>
-          <w:numId w:val="6"/>
+          <w:numId w:val="3"/>
         </w:numPr>
         <w:spacing w:after="60"/>
       </w:pPr>
@@ -1597,7 +1693,7 @@
         <w:pStyle w:val="ListParagraph"/>
         <w:numPr>
           <w:ilvl w:val="0"/>
-          <w:numId w:val="6"/>
+          <w:numId w:val="3"/>
         </w:numPr>
         <w:spacing w:after="60"/>
       </w:pPr>
@@ -1622,7 +1718,7 @@
         <w:pStyle w:val="ListParagraph"/>
         <w:numPr>
           <w:ilvl w:val="0"/>
-          <w:numId w:val="6"/>
+          <w:numId w:val="3"/>
         </w:numPr>
         <w:spacing w:after="60"/>
       </w:pPr>
@@ -1647,7 +1743,7 @@
         <w:pStyle w:val="ListParagraph"/>
         <w:numPr>
           <w:ilvl w:val="0"/>
-          <w:numId w:val="6"/>
+          <w:numId w:val="3"/>
         </w:numPr>
         <w:spacing w:after="60"/>
       </w:pPr>
@@ -1724,6 +1820,15 @@
       </w:r>
       <w:r>
         <w:t xml:space="preserve">. It is used here to understand the supply side of the distribution gap, that is, why small retailers stock Juhayna more readily than Danone. The chosen technique is the depth interview rather than the focus group, because retailers are competitors to one another and are usually busy at their shops, and one-to-one interviews elicit more candid answers about stocking decisions, sales-representative behaviour, and margins.</w:t>
+      </w:r>
+    </w:p>
+    <w:p>
+      <w:pPr>
+        <w:spacing w:after="140"/>
+        <w:jc w:val="both"/>
+      </w:pPr>
+      <w:r>
+        <w:t xml:space="preserve">Malhotra recommends the depth interview over the focus group precisely for cases like this one: for competitors and busy professionals who would not speak openly in a group, and for sensitive or confidential topics. Four features of our retailers make it the right choice. First, neighbouring shop owners compete with one another and would not disclose their margins, credit terms, or supplier relationships in front of rivals. Second, those topics are commercially sensitive and are shared far more candidly one to one. Third, grocers are busy and tied to their counters, so they cannot leave to attend a scheduled group session. Fourth, the shops are spread across several governorates, which makes gathering the eight to twelve similar participants that a focus group requires impractical. For the consumer side, by contrast, we did not use focus groups either; consumer attitudes were captured through the structured survey in Chapter 5.</w:t>
       </w:r>
     </w:p>
     <w:p>
@@ -2700,6 +2805,15 @@
     </w:p>
     <w:p>
       <w:pPr>
+        <w:spacing w:after="140"/>
+        <w:jc w:val="both"/>
+      </w:pPr>
+      <w:r>
+        <w:t xml:space="preserve">Placed within Malhotra's classification of survey methods (Figure 5.4), which groups surveys into four modes, telephone, personal, mail, and electronic, and nine methods in total, this study uses the electronic mode and, specifically, the Internet survey: a questionnaire posted on a website and self-administered by the respondent. It was preferred over the telephone, personal, and mail methods because its speed, low cost, and wide geographic reach are well suited to a student project, and because respondents can complete it in their own time from a phone.</w:t>
+      </w:r>
+    </w:p>
+    <w:p>
+      <w:pPr>
         <w:pStyle w:val="Heading2"/>
       </w:pPr>
       <w:r>
@@ -5859,7 +5973,7 @@
         <w:pStyle w:val="ListParagraph"/>
         <w:numPr>
           <w:ilvl w:val="0"/>
-          <w:numId w:val="6"/>
+          <w:numId w:val="3"/>
         </w:numPr>
         <w:spacing w:after="60"/>
       </w:pPr>
@@ -5872,7 +5986,7 @@
         <w:pStyle w:val="ListParagraph"/>
         <w:numPr>
           <w:ilvl w:val="0"/>
-          <w:numId w:val="6"/>
+          <w:numId w:val="3"/>
         </w:numPr>
         <w:spacing w:after="60"/>
       </w:pPr>
@@ -5885,7 +5999,7 @@
         <w:pStyle w:val="ListParagraph"/>
         <w:numPr>
           <w:ilvl w:val="0"/>
-          <w:numId w:val="6"/>
+          <w:numId w:val="3"/>
         </w:numPr>
         <w:spacing w:after="60"/>
       </w:pPr>
@@ -5898,7 +6012,7 @@
         <w:pStyle w:val="ListParagraph"/>
         <w:numPr>
           <w:ilvl w:val="0"/>
-          <w:numId w:val="6"/>
+          <w:numId w:val="3"/>
         </w:numPr>
         <w:spacing w:after="60"/>
       </w:pPr>
@@ -5911,7 +6025,7 @@
         <w:pStyle w:val="ListParagraph"/>
         <w:numPr>
           <w:ilvl w:val="0"/>
-          <w:numId w:val="6"/>
+          <w:numId w:val="3"/>
         </w:numPr>
         <w:spacing w:after="60"/>
       </w:pPr>
@@ -5924,7 +6038,7 @@
         <w:pStyle w:val="ListParagraph"/>
         <w:numPr>
           <w:ilvl w:val="0"/>
-          <w:numId w:val="6"/>
+          <w:numId w:val="3"/>
         </w:numPr>
         <w:spacing w:after="60"/>
       </w:pPr>
@@ -6613,7 +6727,7 @@
       <w:r>
         <w:t xml:space="preserve">  </w:t>
       </w:r>
-      <w:hyperlink w:history="1" r:id="rId1pjrzot1vcbdahln0nf0c">
+      <w:hyperlink w:history="1" r:id="rIdywzls7lwictrartxhwwot">
         <w:r>
           <w:rPr>
             <w:rStyle w:val="Hyperlink"/>
@@ -6640,7 +6754,7 @@
       <w:r>
         <w:t xml:space="preserve">  </w:t>
       </w:r>
-      <w:hyperlink w:history="1" r:id="rIdmw8ppcdu3jyxamkaqxrfv">
+      <w:hyperlink w:history="1" r:id="rIdvnftd5det2_0swew9tilo">
         <w:r>
           <w:rPr>
             <w:rStyle w:val="Hyperlink"/>
@@ -6651,7 +6765,7 @@
       <w:r>
         <w:t xml:space="preserve">  /  </w:t>
       </w:r>
-      <w:hyperlink w:history="1" r:id="rIdt3chfsdnvygyivod4egx2">
+      <w:hyperlink w:history="1" r:id="rIdneudht22zse-zi4swgqr-">
         <w:r>
           <w:rPr>
             <w:rStyle w:val="Hyperlink"/>
@@ -6678,7 +6792,7 @@
       <w:r>
         <w:t xml:space="preserve">  </w:t>
       </w:r>
-      <w:hyperlink w:history="1" r:id="rIduqc-r0wokgxfkyrcive9_">
+      <w:hyperlink w:history="1" r:id="rIdakgufsc_nkiahjcwcne1h">
         <w:r>
           <w:rPr>
             <w:rStyle w:val="Hyperlink"/>
@@ -6705,7 +6819,7 @@
       <w:r>
         <w:t xml:space="preserve">  </w:t>
       </w:r>
-      <w:hyperlink w:history="1" r:id="rIdckxt45tzsufulnzjjzwrg">
+      <w:hyperlink w:history="1" r:id="rIdh62muhi2vc61vle1t_i7r">
         <w:r>
           <w:rPr>
             <w:rStyle w:val="Hyperlink"/>
@@ -6732,7 +6846,7 @@
       <w:r>
         <w:t xml:space="preserve">  </w:t>
       </w:r>
-      <w:hyperlink w:history="1" r:id="rIdjwaxyryzzcd5_lgridkl5">
+      <w:hyperlink w:history="1" r:id="rIdzom58e4as6vo7smwyxwvg">
         <w:r>
           <w:rPr>
             <w:rStyle w:val="Hyperlink"/>
@@ -6759,7 +6873,7 @@
       <w:r>
         <w:t xml:space="preserve">  </w:t>
       </w:r>
-      <w:hyperlink w:history="1" r:id="rIdpjet5lbqsmdn0vi77i0ca">
+      <w:hyperlink w:history="1" r:id="rIdge7ykvqcxoursub6vpsp-">
         <w:r>
           <w:rPr>
             <w:rStyle w:val="Hyperlink"/>
@@ -7094,25 +7208,25 @@
     </w:lvlOverride>
   </w:num>
   <w:num w:numId="3">
+    <w:abstractNumId w:val="2"/>
+    <w:lvlOverride w:ilvl="0">
+      <w:startOverride w:val="1"/>
+    </w:lvlOverride>
+  </w:num>
+  <w:num w:numId="4">
     <w:abstractNumId w:val="6"/>
     <w:lvlOverride w:ilvl="0">
       <w:startOverride w:val="1"/>
     </w:lvlOverride>
   </w:num>
-  <w:num w:numId="4">
+  <w:num w:numId="5">
     <w:abstractNumId w:val="4"/>
     <w:lvlOverride w:ilvl="0">
       <w:startOverride w:val="1"/>
     </w:lvlOverride>
   </w:num>
-  <w:num w:numId="5">
+  <w:num w:numId="6">
     <w:abstractNumId w:val="5"/>
-    <w:lvlOverride w:ilvl="0">
-      <w:startOverride w:val="1"/>
-    </w:lvlOverride>
-  </w:num>
-  <w:num w:numId="6">
-    <w:abstractNumId w:val="2"/>
     <w:lvlOverride w:ilvl="0">
       <w:startOverride w:val="1"/>
     </w:lvlOverride>

</xml_diff>